<commit_message>
JECH resubmission: Background/aims abstract heading, footer page numbers, STROBE page-number column
Co-Authored-By: Tatsuki Onishi <bougtoir@gmail.com>
</commit_message>
<xml_diff>
--- a/documents/JECH/STROBE_checklist_JECH_EN.docx
+++ b/documents/JECH/STROBE_checklist_JECH_EN.docx
@@ -34,15 +34,16 @@
         <w:tblLook w:firstColumn="1" w:firstRow="1" w:lastColumn="0" w:lastRow="0" w:noHBand="0" w:noVBand="1" w:val="04A0"/>
       </w:tblPr>
       <w:tblGrid>
-        <w:gridCol w:w="3699"/>
-        <w:gridCol w:w="3699"/>
-        <w:gridCol w:w="3699"/>
-        <w:gridCol w:w="3699"/>
+        <w:gridCol w:w="2960"/>
+        <w:gridCol w:w="2960"/>
+        <w:gridCol w:w="2960"/>
+        <w:gridCol w:w="2960"/>
+        <w:gridCol w:w="2960"/>
       </w:tblGrid>
       <w:tr>
         <w:tc>
           <w:tcPr>
-            <w:tcW w:type="dxa" w:w="2268"/>
+            <w:tcW w:type="dxa" w:w="2154"/>
           </w:tcPr>
           <w:p>
             <w:r/>
@@ -57,7 +58,7 @@
         </w:tc>
         <w:tc>
           <w:tcPr>
-            <w:tcW w:type="dxa" w:w="850"/>
+            <w:tcW w:type="dxa" w:w="794"/>
           </w:tcPr>
           <w:p>
             <w:r/>
@@ -72,7 +73,7 @@
         </w:tc>
         <w:tc>
           <w:tcPr>
-            <w:tcW w:type="dxa" w:w="6236"/>
+            <w:tcW w:type="dxa" w:w="5102"/>
           </w:tcPr>
           <w:p>
             <w:r/>
@@ -87,7 +88,7 @@
         </w:tc>
         <w:tc>
           <w:tcPr>
-            <w:tcW w:type="dxa" w:w="5102"/>
+            <w:tcW w:type="dxa" w:w="3969"/>
           </w:tcPr>
           <w:p>
             <w:r/>
@@ -100,11 +101,26 @@
             </w:r>
           </w:p>
         </w:tc>
+        <w:tc>
+          <w:tcPr>
+            <w:tcW w:type="dxa" w:w="1247"/>
+          </w:tcPr>
+          <w:p>
+            <w:r/>
+            <w:r>
+              <w:rPr>
+                <w:b/>
+                <w:sz w:val="20"/>
+              </w:rPr>
+              <w:t>Page</w:t>
+            </w:r>
+          </w:p>
+        </w:tc>
       </w:tr>
       <w:tr>
         <w:tc>
           <w:tcPr>
-            <w:tcW w:type="dxa" w:w="2268"/>
+            <w:tcW w:type="dxa" w:w="2154"/>
           </w:tcPr>
           <w:p>
             <w:r/>
@@ -118,7 +134,7 @@
         </w:tc>
         <w:tc>
           <w:tcPr>
-            <w:tcW w:type="dxa" w:w="850"/>
+            <w:tcW w:type="dxa" w:w="794"/>
           </w:tcPr>
           <w:p>
             <w:r/>
@@ -132,7 +148,7 @@
         </w:tc>
         <w:tc>
           <w:tcPr>
-            <w:tcW w:type="dxa" w:w="6236"/>
+            <w:tcW w:type="dxa" w:w="5102"/>
           </w:tcPr>
           <w:p>
             <w:r/>
@@ -146,7 +162,7 @@
         </w:tc>
         <w:tc>
           <w:tcPr>
-            <w:tcW w:type="dxa" w:w="5102"/>
+            <w:tcW w:type="dxa" w:w="3969"/>
           </w:tcPr>
           <w:p>
             <w:r/>
@@ -158,11 +174,25 @@
             </w:r>
           </w:p>
         </w:tc>
+        <w:tc>
+          <w:tcPr>
+            <w:tcW w:type="dxa" w:w="1247"/>
+          </w:tcPr>
+          <w:p>
+            <w:r/>
+            <w:r>
+              <w:rPr>
+                <w:sz w:val="18"/>
+              </w:rPr>
+              <w:t>1, 2–3</w:t>
+            </w:r>
+          </w:p>
+        </w:tc>
       </w:tr>
       <w:tr>
         <w:tc>
           <w:tcPr>
-            <w:tcW w:type="dxa" w:w="2268"/>
+            <w:tcW w:type="dxa" w:w="2154"/>
           </w:tcPr>
           <w:p>
             <w:r/>
@@ -175,7 +205,7 @@
         </w:tc>
         <w:tc>
           <w:tcPr>
-            <w:tcW w:type="dxa" w:w="850"/>
+            <w:tcW w:type="dxa" w:w="794"/>
           </w:tcPr>
           <w:p>
             <w:r/>
@@ -189,7 +219,7 @@
         </w:tc>
         <w:tc>
           <w:tcPr>
-            <w:tcW w:type="dxa" w:w="6236"/>
+            <w:tcW w:type="dxa" w:w="5102"/>
           </w:tcPr>
           <w:p>
             <w:r/>
@@ -203,7 +233,7 @@
         </w:tc>
         <w:tc>
           <w:tcPr>
-            <w:tcW w:type="dxa" w:w="5102"/>
+            <w:tcW w:type="dxa" w:w="3969"/>
           </w:tcPr>
           <w:p>
             <w:r/>
@@ -211,7 +241,21 @@
               <w:rPr>
                 <w:sz w:val="18"/>
               </w:rPr>
-              <w:t>Abstract: structured subheadings Background / Methods / Results / Conclusion</w:t>
+              <w:t>Abstract: structured subheadings Background/aims / Methods / Results / Conclusion</w:t>
+            </w:r>
+          </w:p>
+        </w:tc>
+        <w:tc>
+          <w:tcPr>
+            <w:tcW w:type="dxa" w:w="1247"/>
+          </w:tcPr>
+          <w:p>
+            <w:r/>
+            <w:r>
+              <w:rPr>
+                <w:sz w:val="18"/>
+              </w:rPr>
+              <w:t>2–3</w:t>
             </w:r>
           </w:p>
         </w:tc>
@@ -219,7 +263,7 @@
       <w:tr>
         <w:tc>
           <w:tcPr>
-            <w:tcW w:type="dxa" w:w="2268"/>
+            <w:tcW w:type="dxa" w:w="2154"/>
           </w:tcPr>
           <w:p>
             <w:r/>
@@ -235,20 +279,7 @@
         </w:tc>
         <w:tc>
           <w:tcPr>
-            <w:tcW w:type="dxa" w:w="850"/>
-          </w:tcPr>
-          <w:p>
-            <w:r/>
-            <w:r>
-              <w:rPr>
-                <w:sz w:val="18"/>
-              </w:rPr>
-            </w:r>
-          </w:p>
-        </w:tc>
-        <w:tc>
-          <w:tcPr>
-            <w:tcW w:type="dxa" w:w="6236"/>
+            <w:tcW w:type="dxa" w:w="794"/>
           </w:tcPr>
           <w:p>
             <w:r/>
@@ -272,11 +303,37 @@
             </w:r>
           </w:p>
         </w:tc>
+        <w:tc>
+          <w:tcPr>
+            <w:tcW w:type="dxa" w:w="3969"/>
+          </w:tcPr>
+          <w:p>
+            <w:r/>
+            <w:r>
+              <w:rPr>
+                <w:sz w:val="18"/>
+              </w:rPr>
+            </w:r>
+          </w:p>
+        </w:tc>
+        <w:tc>
+          <w:tcPr>
+            <w:tcW w:type="dxa" w:w="1247"/>
+          </w:tcPr>
+          <w:p>
+            <w:r/>
+            <w:r>
+              <w:rPr>
+                <w:sz w:val="18"/>
+              </w:rPr>
+            </w:r>
+          </w:p>
+        </w:tc>
       </w:tr>
       <w:tr>
         <w:tc>
           <w:tcPr>
-            <w:tcW w:type="dxa" w:w="2268"/>
+            <w:tcW w:type="dxa" w:w="2154"/>
           </w:tcPr>
           <w:p>
             <w:r/>
@@ -290,7 +347,7 @@
         </w:tc>
         <w:tc>
           <w:tcPr>
-            <w:tcW w:type="dxa" w:w="850"/>
+            <w:tcW w:type="dxa" w:w="794"/>
           </w:tcPr>
           <w:p>
             <w:r/>
@@ -304,7 +361,7 @@
         </w:tc>
         <w:tc>
           <w:tcPr>
-            <w:tcW w:type="dxa" w:w="6236"/>
+            <w:tcW w:type="dxa" w:w="5102"/>
           </w:tcPr>
           <w:p>
             <w:r/>
@@ -318,7 +375,7 @@
         </w:tc>
         <w:tc>
           <w:tcPr>
-            <w:tcW w:type="dxa" w:w="5102"/>
+            <w:tcW w:type="dxa" w:w="3969"/>
           </w:tcPr>
           <w:p>
             <w:r/>
@@ -330,11 +387,25 @@
             </w:r>
           </w:p>
         </w:tc>
+        <w:tc>
+          <w:tcPr>
+            <w:tcW w:type="dxa" w:w="1247"/>
+          </w:tcPr>
+          <w:p>
+            <w:r/>
+            <w:r>
+              <w:rPr>
+                <w:sz w:val="18"/>
+              </w:rPr>
+              <w:t>5</w:t>
+            </w:r>
+          </w:p>
+        </w:tc>
       </w:tr>
       <w:tr>
         <w:tc>
           <w:tcPr>
-            <w:tcW w:type="dxa" w:w="2268"/>
+            <w:tcW w:type="dxa" w:w="2154"/>
           </w:tcPr>
           <w:p>
             <w:r/>
@@ -348,7 +419,7 @@
         </w:tc>
         <w:tc>
           <w:tcPr>
-            <w:tcW w:type="dxa" w:w="850"/>
+            <w:tcW w:type="dxa" w:w="794"/>
           </w:tcPr>
           <w:p>
             <w:r/>
@@ -362,7 +433,7 @@
         </w:tc>
         <w:tc>
           <w:tcPr>
-            <w:tcW w:type="dxa" w:w="6236"/>
+            <w:tcW w:type="dxa" w:w="5102"/>
           </w:tcPr>
           <w:p>
             <w:r/>
@@ -376,7 +447,7 @@
         </w:tc>
         <w:tc>
           <w:tcPr>
-            <w:tcW w:type="dxa" w:w="5102"/>
+            <w:tcW w:type="dxa" w:w="3969"/>
           </w:tcPr>
           <w:p>
             <w:r/>
@@ -388,11 +459,25 @@
             </w:r>
           </w:p>
         </w:tc>
+        <w:tc>
+          <w:tcPr>
+            <w:tcW w:type="dxa" w:w="1247"/>
+          </w:tcPr>
+          <w:p>
+            <w:r/>
+            <w:r>
+              <w:rPr>
+                <w:sz w:val="18"/>
+              </w:rPr>
+              <w:t>5</w:t>
+            </w:r>
+          </w:p>
+        </w:tc>
       </w:tr>
       <w:tr>
         <w:tc>
           <w:tcPr>
-            <w:tcW w:type="dxa" w:w="2268"/>
+            <w:tcW w:type="dxa" w:w="2154"/>
           </w:tcPr>
           <w:p>
             <w:r/>
@@ -408,20 +493,7 @@
         </w:tc>
         <w:tc>
           <w:tcPr>
-            <w:tcW w:type="dxa" w:w="850"/>
-          </w:tcPr>
-          <w:p>
-            <w:r/>
-            <w:r>
-              <w:rPr>
-                <w:sz w:val="18"/>
-              </w:rPr>
-            </w:r>
-          </w:p>
-        </w:tc>
-        <w:tc>
-          <w:tcPr>
-            <w:tcW w:type="dxa" w:w="6236"/>
+            <w:tcW w:type="dxa" w:w="794"/>
           </w:tcPr>
           <w:p>
             <w:r/>
@@ -445,11 +517,37 @@
             </w:r>
           </w:p>
         </w:tc>
+        <w:tc>
+          <w:tcPr>
+            <w:tcW w:type="dxa" w:w="3969"/>
+          </w:tcPr>
+          <w:p>
+            <w:r/>
+            <w:r>
+              <w:rPr>
+                <w:sz w:val="18"/>
+              </w:rPr>
+            </w:r>
+          </w:p>
+        </w:tc>
+        <w:tc>
+          <w:tcPr>
+            <w:tcW w:type="dxa" w:w="1247"/>
+          </w:tcPr>
+          <w:p>
+            <w:r/>
+            <w:r>
+              <w:rPr>
+                <w:sz w:val="18"/>
+              </w:rPr>
+            </w:r>
+          </w:p>
+        </w:tc>
       </w:tr>
       <w:tr>
         <w:tc>
           <w:tcPr>
-            <w:tcW w:type="dxa" w:w="2268"/>
+            <w:tcW w:type="dxa" w:w="2154"/>
           </w:tcPr>
           <w:p>
             <w:r/>
@@ -463,7 +561,7 @@
         </w:tc>
         <w:tc>
           <w:tcPr>
-            <w:tcW w:type="dxa" w:w="850"/>
+            <w:tcW w:type="dxa" w:w="794"/>
           </w:tcPr>
           <w:p>
             <w:r/>
@@ -477,7 +575,7 @@
         </w:tc>
         <w:tc>
           <w:tcPr>
-            <w:tcW w:type="dxa" w:w="6236"/>
+            <w:tcW w:type="dxa" w:w="5102"/>
           </w:tcPr>
           <w:p>
             <w:r/>
@@ -491,7 +589,7 @@
         </w:tc>
         <w:tc>
           <w:tcPr>
-            <w:tcW w:type="dxa" w:w="5102"/>
+            <w:tcW w:type="dxa" w:w="3969"/>
           </w:tcPr>
           <w:p>
             <w:r/>
@@ -503,11 +601,25 @@
             </w:r>
           </w:p>
         </w:tc>
+        <w:tc>
+          <w:tcPr>
+            <w:tcW w:type="dxa" w:w="1247"/>
+          </w:tcPr>
+          <w:p>
+            <w:r/>
+            <w:r>
+              <w:rPr>
+                <w:sz w:val="18"/>
+              </w:rPr>
+              <w:t>6–7</w:t>
+            </w:r>
+          </w:p>
+        </w:tc>
       </w:tr>
       <w:tr>
         <w:tc>
           <w:tcPr>
-            <w:tcW w:type="dxa" w:w="2268"/>
+            <w:tcW w:type="dxa" w:w="2154"/>
           </w:tcPr>
           <w:p>
             <w:r/>
@@ -521,7 +633,7 @@
         </w:tc>
         <w:tc>
           <w:tcPr>
-            <w:tcW w:type="dxa" w:w="850"/>
+            <w:tcW w:type="dxa" w:w="794"/>
           </w:tcPr>
           <w:p>
             <w:r/>
@@ -535,7 +647,7 @@
         </w:tc>
         <w:tc>
           <w:tcPr>
-            <w:tcW w:type="dxa" w:w="6236"/>
+            <w:tcW w:type="dxa" w:w="5102"/>
           </w:tcPr>
           <w:p>
             <w:r/>
@@ -549,7 +661,7 @@
         </w:tc>
         <w:tc>
           <w:tcPr>
-            <w:tcW w:type="dxa" w:w="5102"/>
+            <w:tcW w:type="dxa" w:w="3969"/>
           </w:tcPr>
           <w:p>
             <w:r/>
@@ -561,11 +673,25 @@
             </w:r>
           </w:p>
         </w:tc>
+        <w:tc>
+          <w:tcPr>
+            <w:tcW w:type="dxa" w:w="1247"/>
+          </w:tcPr>
+          <w:p>
+            <w:r/>
+            <w:r>
+              <w:rPr>
+                <w:sz w:val="18"/>
+              </w:rPr>
+              <w:t>6–7</w:t>
+            </w:r>
+          </w:p>
+        </w:tc>
       </w:tr>
       <w:tr>
         <w:tc>
           <w:tcPr>
-            <w:tcW w:type="dxa" w:w="2268"/>
+            <w:tcW w:type="dxa" w:w="2154"/>
           </w:tcPr>
           <w:p>
             <w:r/>
@@ -579,7 +705,7 @@
         </w:tc>
         <w:tc>
           <w:tcPr>
-            <w:tcW w:type="dxa" w:w="850"/>
+            <w:tcW w:type="dxa" w:w="794"/>
           </w:tcPr>
           <w:p>
             <w:r/>
@@ -593,7 +719,7 @@
         </w:tc>
         <w:tc>
           <w:tcPr>
-            <w:tcW w:type="dxa" w:w="6236"/>
+            <w:tcW w:type="dxa" w:w="5102"/>
           </w:tcPr>
           <w:p>
             <w:r/>
@@ -607,7 +733,7 @@
         </w:tc>
         <w:tc>
           <w:tcPr>
-            <w:tcW w:type="dxa" w:w="5102"/>
+            <w:tcW w:type="dxa" w:w="3969"/>
           </w:tcPr>
           <w:p>
             <w:r/>
@@ -619,11 +745,25 @@
             </w:r>
           </w:p>
         </w:tc>
+        <w:tc>
+          <w:tcPr>
+            <w:tcW w:type="dxa" w:w="1247"/>
+          </w:tcPr>
+          <w:p>
+            <w:r/>
+            <w:r>
+              <w:rPr>
+                <w:sz w:val="18"/>
+              </w:rPr>
+              <w:t>6–7</w:t>
+            </w:r>
+          </w:p>
+        </w:tc>
       </w:tr>
       <w:tr>
         <w:tc>
           <w:tcPr>
-            <w:tcW w:type="dxa" w:w="2268"/>
+            <w:tcW w:type="dxa" w:w="2154"/>
           </w:tcPr>
           <w:p>
             <w:r/>
@@ -637,7 +777,7 @@
         </w:tc>
         <w:tc>
           <w:tcPr>
-            <w:tcW w:type="dxa" w:w="850"/>
+            <w:tcW w:type="dxa" w:w="794"/>
           </w:tcPr>
           <w:p>
             <w:r/>
@@ -651,7 +791,7 @@
         </w:tc>
         <w:tc>
           <w:tcPr>
-            <w:tcW w:type="dxa" w:w="6236"/>
+            <w:tcW w:type="dxa" w:w="5102"/>
           </w:tcPr>
           <w:p>
             <w:r/>
@@ -665,7 +805,7 @@
         </w:tc>
         <w:tc>
           <w:tcPr>
-            <w:tcW w:type="dxa" w:w="5102"/>
+            <w:tcW w:type="dxa" w:w="3969"/>
           </w:tcPr>
           <w:p>
             <w:r/>
@@ -677,11 +817,25 @@
             </w:r>
           </w:p>
         </w:tc>
+        <w:tc>
+          <w:tcPr>
+            <w:tcW w:type="dxa" w:w="1247"/>
+          </w:tcPr>
+          <w:p>
+            <w:r/>
+            <w:r>
+              <w:rPr>
+                <w:sz w:val="18"/>
+              </w:rPr>
+              <w:t>6–7</w:t>
+            </w:r>
+          </w:p>
+        </w:tc>
       </w:tr>
       <w:tr>
         <w:tc>
           <w:tcPr>
-            <w:tcW w:type="dxa" w:w="2268"/>
+            <w:tcW w:type="dxa" w:w="2154"/>
           </w:tcPr>
           <w:p>
             <w:r/>
@@ -695,7 +849,7 @@
         </w:tc>
         <w:tc>
           <w:tcPr>
-            <w:tcW w:type="dxa" w:w="850"/>
+            <w:tcW w:type="dxa" w:w="794"/>
           </w:tcPr>
           <w:p>
             <w:r/>
@@ -709,7 +863,7 @@
         </w:tc>
         <w:tc>
           <w:tcPr>
-            <w:tcW w:type="dxa" w:w="6236"/>
+            <w:tcW w:type="dxa" w:w="5102"/>
           </w:tcPr>
           <w:p>
             <w:r/>
@@ -723,7 +877,7 @@
         </w:tc>
         <w:tc>
           <w:tcPr>
-            <w:tcW w:type="dxa" w:w="5102"/>
+            <w:tcW w:type="dxa" w:w="3969"/>
           </w:tcPr>
           <w:p>
             <w:r/>
@@ -735,11 +889,25 @@
             </w:r>
           </w:p>
         </w:tc>
+        <w:tc>
+          <w:tcPr>
+            <w:tcW w:type="dxa" w:w="1247"/>
+          </w:tcPr>
+          <w:p>
+            <w:r/>
+            <w:r>
+              <w:rPr>
+                <w:sz w:val="18"/>
+              </w:rPr>
+              <w:t>6–7</w:t>
+            </w:r>
+          </w:p>
+        </w:tc>
       </w:tr>
       <w:tr>
         <w:tc>
           <w:tcPr>
-            <w:tcW w:type="dxa" w:w="2268"/>
+            <w:tcW w:type="dxa" w:w="2154"/>
           </w:tcPr>
           <w:p>
             <w:r/>
@@ -753,7 +921,7 @@
         </w:tc>
         <w:tc>
           <w:tcPr>
-            <w:tcW w:type="dxa" w:w="850"/>
+            <w:tcW w:type="dxa" w:w="794"/>
           </w:tcPr>
           <w:p>
             <w:r/>
@@ -767,7 +935,7 @@
         </w:tc>
         <w:tc>
           <w:tcPr>
-            <w:tcW w:type="dxa" w:w="6236"/>
+            <w:tcW w:type="dxa" w:w="5102"/>
           </w:tcPr>
           <w:p>
             <w:r/>
@@ -781,7 +949,7 @@
         </w:tc>
         <w:tc>
           <w:tcPr>
-            <w:tcW w:type="dxa" w:w="5102"/>
+            <w:tcW w:type="dxa" w:w="3969"/>
           </w:tcPr>
           <w:p>
             <w:r/>
@@ -793,11 +961,25 @@
             </w:r>
           </w:p>
         </w:tc>
+        <w:tc>
+          <w:tcPr>
+            <w:tcW w:type="dxa" w:w="1247"/>
+          </w:tcPr>
+          <w:p>
+            <w:r/>
+            <w:r>
+              <w:rPr>
+                <w:sz w:val="18"/>
+              </w:rPr>
+              <w:t>6–7</w:t>
+            </w:r>
+          </w:p>
+        </w:tc>
       </w:tr>
       <w:tr>
         <w:tc>
           <w:tcPr>
-            <w:tcW w:type="dxa" w:w="2268"/>
+            <w:tcW w:type="dxa" w:w="2154"/>
           </w:tcPr>
           <w:p>
             <w:r/>
@@ -811,7 +993,7 @@
         </w:tc>
         <w:tc>
           <w:tcPr>
-            <w:tcW w:type="dxa" w:w="850"/>
+            <w:tcW w:type="dxa" w:w="794"/>
           </w:tcPr>
           <w:p>
             <w:r/>
@@ -825,7 +1007,7 @@
         </w:tc>
         <w:tc>
           <w:tcPr>
-            <w:tcW w:type="dxa" w:w="6236"/>
+            <w:tcW w:type="dxa" w:w="5102"/>
           </w:tcPr>
           <w:p>
             <w:r/>
@@ -839,7 +1021,7 @@
         </w:tc>
         <w:tc>
           <w:tcPr>
-            <w:tcW w:type="dxa" w:w="5102"/>
+            <w:tcW w:type="dxa" w:w="3969"/>
           </w:tcPr>
           <w:p>
             <w:r/>
@@ -851,11 +1033,25 @@
             </w:r>
           </w:p>
         </w:tc>
+        <w:tc>
+          <w:tcPr>
+            <w:tcW w:type="dxa" w:w="1247"/>
+          </w:tcPr>
+          <w:p>
+            <w:r/>
+            <w:r>
+              <w:rPr>
+                <w:sz w:val="18"/>
+              </w:rPr>
+              <w:t>6–7</w:t>
+            </w:r>
+          </w:p>
+        </w:tc>
       </w:tr>
       <w:tr>
         <w:tc>
           <w:tcPr>
-            <w:tcW w:type="dxa" w:w="2268"/>
+            <w:tcW w:type="dxa" w:w="2154"/>
           </w:tcPr>
           <w:p>
             <w:r/>
@@ -869,7 +1065,7 @@
         </w:tc>
         <w:tc>
           <w:tcPr>
-            <w:tcW w:type="dxa" w:w="850"/>
+            <w:tcW w:type="dxa" w:w="794"/>
           </w:tcPr>
           <w:p>
             <w:r/>
@@ -883,7 +1079,7 @@
         </w:tc>
         <w:tc>
           <w:tcPr>
-            <w:tcW w:type="dxa" w:w="6236"/>
+            <w:tcW w:type="dxa" w:w="5102"/>
           </w:tcPr>
           <w:p>
             <w:r/>
@@ -897,7 +1093,7 @@
         </w:tc>
         <w:tc>
           <w:tcPr>
-            <w:tcW w:type="dxa" w:w="5102"/>
+            <w:tcW w:type="dxa" w:w="3969"/>
           </w:tcPr>
           <w:p>
             <w:r/>
@@ -909,11 +1105,25 @@
             </w:r>
           </w:p>
         </w:tc>
+        <w:tc>
+          <w:tcPr>
+            <w:tcW w:type="dxa" w:w="1247"/>
+          </w:tcPr>
+          <w:p>
+            <w:r/>
+            <w:r>
+              <w:rPr>
+                <w:sz w:val="18"/>
+              </w:rPr>
+              <w:t>6–7</w:t>
+            </w:r>
+          </w:p>
+        </w:tc>
       </w:tr>
       <w:tr>
         <w:tc>
           <w:tcPr>
-            <w:tcW w:type="dxa" w:w="2268"/>
+            <w:tcW w:type="dxa" w:w="2154"/>
           </w:tcPr>
           <w:p>
             <w:r/>
@@ -927,7 +1137,7 @@
         </w:tc>
         <w:tc>
           <w:tcPr>
-            <w:tcW w:type="dxa" w:w="850"/>
+            <w:tcW w:type="dxa" w:w="794"/>
           </w:tcPr>
           <w:p>
             <w:r/>
@@ -941,7 +1151,7 @@
         </w:tc>
         <w:tc>
           <w:tcPr>
-            <w:tcW w:type="dxa" w:w="6236"/>
+            <w:tcW w:type="dxa" w:w="5102"/>
           </w:tcPr>
           <w:p>
             <w:r/>
@@ -955,7 +1165,7 @@
         </w:tc>
         <w:tc>
           <w:tcPr>
-            <w:tcW w:type="dxa" w:w="5102"/>
+            <w:tcW w:type="dxa" w:w="3969"/>
           </w:tcPr>
           <w:p>
             <w:r/>
@@ -967,11 +1177,25 @@
             </w:r>
           </w:p>
         </w:tc>
+        <w:tc>
+          <w:tcPr>
+            <w:tcW w:type="dxa" w:w="1247"/>
+          </w:tcPr>
+          <w:p>
+            <w:r/>
+            <w:r>
+              <w:rPr>
+                <w:sz w:val="18"/>
+              </w:rPr>
+              <w:t>6–7</w:t>
+            </w:r>
+          </w:p>
+        </w:tc>
       </w:tr>
       <w:tr>
         <w:tc>
           <w:tcPr>
-            <w:tcW w:type="dxa" w:w="2268"/>
+            <w:tcW w:type="dxa" w:w="2154"/>
           </w:tcPr>
           <w:p>
             <w:r/>
@@ -984,7 +1208,7 @@
         </w:tc>
         <w:tc>
           <w:tcPr>
-            <w:tcW w:type="dxa" w:w="850"/>
+            <w:tcW w:type="dxa" w:w="794"/>
           </w:tcPr>
           <w:p>
             <w:r/>
@@ -998,7 +1222,7 @@
         </w:tc>
         <w:tc>
           <w:tcPr>
-            <w:tcW w:type="dxa" w:w="6236"/>
+            <w:tcW w:type="dxa" w:w="5102"/>
           </w:tcPr>
           <w:p>
             <w:r/>
@@ -1012,7 +1236,7 @@
         </w:tc>
         <w:tc>
           <w:tcPr>
-            <w:tcW w:type="dxa" w:w="5102"/>
+            <w:tcW w:type="dxa" w:w="3969"/>
           </w:tcPr>
           <w:p>
             <w:r/>
@@ -1024,11 +1248,25 @@
             </w:r>
           </w:p>
         </w:tc>
+        <w:tc>
+          <w:tcPr>
+            <w:tcW w:type="dxa" w:w="1247"/>
+          </w:tcPr>
+          <w:p>
+            <w:r/>
+            <w:r>
+              <w:rPr>
+                <w:sz w:val="18"/>
+              </w:rPr>
+              <w:t>6–7</w:t>
+            </w:r>
+          </w:p>
+        </w:tc>
       </w:tr>
       <w:tr>
         <w:tc>
           <w:tcPr>
-            <w:tcW w:type="dxa" w:w="2268"/>
+            <w:tcW w:type="dxa" w:w="2154"/>
           </w:tcPr>
           <w:p>
             <w:r/>
@@ -1041,7 +1279,7 @@
         </w:tc>
         <w:tc>
           <w:tcPr>
-            <w:tcW w:type="dxa" w:w="850"/>
+            <w:tcW w:type="dxa" w:w="794"/>
           </w:tcPr>
           <w:p>
             <w:r/>
@@ -1055,7 +1293,7 @@
         </w:tc>
         <w:tc>
           <w:tcPr>
-            <w:tcW w:type="dxa" w:w="6236"/>
+            <w:tcW w:type="dxa" w:w="5102"/>
           </w:tcPr>
           <w:p>
             <w:r/>
@@ -1069,7 +1307,7 @@
         </w:tc>
         <w:tc>
           <w:tcPr>
-            <w:tcW w:type="dxa" w:w="5102"/>
+            <w:tcW w:type="dxa" w:w="3969"/>
           </w:tcPr>
           <w:p>
             <w:r/>
@@ -1081,11 +1319,25 @@
             </w:r>
           </w:p>
         </w:tc>
+        <w:tc>
+          <w:tcPr>
+            <w:tcW w:type="dxa" w:w="1247"/>
+          </w:tcPr>
+          <w:p>
+            <w:r/>
+            <w:r>
+              <w:rPr>
+                <w:sz w:val="18"/>
+              </w:rPr>
+              <w:t>6–7</w:t>
+            </w:r>
+          </w:p>
+        </w:tc>
       </w:tr>
       <w:tr>
         <w:tc>
           <w:tcPr>
-            <w:tcW w:type="dxa" w:w="2268"/>
+            <w:tcW w:type="dxa" w:w="2154"/>
           </w:tcPr>
           <w:p>
             <w:r/>
@@ -1098,7 +1350,7 @@
         </w:tc>
         <w:tc>
           <w:tcPr>
-            <w:tcW w:type="dxa" w:w="850"/>
+            <w:tcW w:type="dxa" w:w="794"/>
           </w:tcPr>
           <w:p>
             <w:r/>
@@ -1112,7 +1364,7 @@
         </w:tc>
         <w:tc>
           <w:tcPr>
-            <w:tcW w:type="dxa" w:w="6236"/>
+            <w:tcW w:type="dxa" w:w="5102"/>
           </w:tcPr>
           <w:p>
             <w:r/>
@@ -1126,7 +1378,7 @@
         </w:tc>
         <w:tc>
           <w:tcPr>
-            <w:tcW w:type="dxa" w:w="5102"/>
+            <w:tcW w:type="dxa" w:w="3969"/>
           </w:tcPr>
           <w:p>
             <w:r/>
@@ -1138,11 +1390,25 @@
             </w:r>
           </w:p>
         </w:tc>
+        <w:tc>
+          <w:tcPr>
+            <w:tcW w:type="dxa" w:w="1247"/>
+          </w:tcPr>
+          <w:p>
+            <w:r/>
+            <w:r>
+              <w:rPr>
+                <w:sz w:val="18"/>
+              </w:rPr>
+              <w:t>6–7</w:t>
+            </w:r>
+          </w:p>
+        </w:tc>
       </w:tr>
       <w:tr>
         <w:tc>
           <w:tcPr>
-            <w:tcW w:type="dxa" w:w="2268"/>
+            <w:tcW w:type="dxa" w:w="2154"/>
           </w:tcPr>
           <w:p>
             <w:r/>
@@ -1155,7 +1421,7 @@
         </w:tc>
         <w:tc>
           <w:tcPr>
-            <w:tcW w:type="dxa" w:w="850"/>
+            <w:tcW w:type="dxa" w:w="794"/>
           </w:tcPr>
           <w:p>
             <w:r/>
@@ -1169,7 +1435,7 @@
         </w:tc>
         <w:tc>
           <w:tcPr>
-            <w:tcW w:type="dxa" w:w="6236"/>
+            <w:tcW w:type="dxa" w:w="5102"/>
           </w:tcPr>
           <w:p>
             <w:r/>
@@ -1183,7 +1449,7 @@
         </w:tc>
         <w:tc>
           <w:tcPr>
-            <w:tcW w:type="dxa" w:w="5102"/>
+            <w:tcW w:type="dxa" w:w="3969"/>
           </w:tcPr>
           <w:p>
             <w:r/>
@@ -1195,11 +1461,25 @@
             </w:r>
           </w:p>
         </w:tc>
+        <w:tc>
+          <w:tcPr>
+            <w:tcW w:type="dxa" w:w="1247"/>
+          </w:tcPr>
+          <w:p>
+            <w:r/>
+            <w:r>
+              <w:rPr>
+                <w:sz w:val="18"/>
+              </w:rPr>
+              <w:t>6–7</w:t>
+            </w:r>
+          </w:p>
+        </w:tc>
       </w:tr>
       <w:tr>
         <w:tc>
           <w:tcPr>
-            <w:tcW w:type="dxa" w:w="2268"/>
+            <w:tcW w:type="dxa" w:w="2154"/>
           </w:tcPr>
           <w:p>
             <w:r/>
@@ -1215,20 +1495,7 @@
         </w:tc>
         <w:tc>
           <w:tcPr>
-            <w:tcW w:type="dxa" w:w="850"/>
-          </w:tcPr>
-          <w:p>
-            <w:r/>
-            <w:r>
-              <w:rPr>
-                <w:sz w:val="18"/>
-              </w:rPr>
-            </w:r>
-          </w:p>
-        </w:tc>
-        <w:tc>
-          <w:tcPr>
-            <w:tcW w:type="dxa" w:w="6236"/>
+            <w:tcW w:type="dxa" w:w="794"/>
           </w:tcPr>
           <w:p>
             <w:r/>
@@ -1252,11 +1519,37 @@
             </w:r>
           </w:p>
         </w:tc>
+        <w:tc>
+          <w:tcPr>
+            <w:tcW w:type="dxa" w:w="3969"/>
+          </w:tcPr>
+          <w:p>
+            <w:r/>
+            <w:r>
+              <w:rPr>
+                <w:sz w:val="18"/>
+              </w:rPr>
+            </w:r>
+          </w:p>
+        </w:tc>
+        <w:tc>
+          <w:tcPr>
+            <w:tcW w:type="dxa" w:w="1247"/>
+          </w:tcPr>
+          <w:p>
+            <w:r/>
+            <w:r>
+              <w:rPr>
+                <w:sz w:val="18"/>
+              </w:rPr>
+            </w:r>
+          </w:p>
+        </w:tc>
       </w:tr>
       <w:tr>
         <w:tc>
           <w:tcPr>
-            <w:tcW w:type="dxa" w:w="2268"/>
+            <w:tcW w:type="dxa" w:w="2154"/>
           </w:tcPr>
           <w:p>
             <w:r/>
@@ -1270,7 +1563,7 @@
         </w:tc>
         <w:tc>
           <w:tcPr>
-            <w:tcW w:type="dxa" w:w="850"/>
+            <w:tcW w:type="dxa" w:w="794"/>
           </w:tcPr>
           <w:p>
             <w:r/>
@@ -1284,7 +1577,7 @@
         </w:tc>
         <w:tc>
           <w:tcPr>
-            <w:tcW w:type="dxa" w:w="6236"/>
+            <w:tcW w:type="dxa" w:w="5102"/>
           </w:tcPr>
           <w:p>
             <w:r/>
@@ -1298,7 +1591,7 @@
         </w:tc>
         <w:tc>
           <w:tcPr>
-            <w:tcW w:type="dxa" w:w="5102"/>
+            <w:tcW w:type="dxa" w:w="3969"/>
           </w:tcPr>
           <w:p>
             <w:r/>
@@ -1310,11 +1603,25 @@
             </w:r>
           </w:p>
         </w:tc>
+        <w:tc>
+          <w:tcPr>
+            <w:tcW w:type="dxa" w:w="1247"/>
+          </w:tcPr>
+          <w:p>
+            <w:r/>
+            <w:r>
+              <w:rPr>
+                <w:sz w:val="18"/>
+              </w:rPr>
+              <w:t>8–12</w:t>
+            </w:r>
+          </w:p>
+        </w:tc>
       </w:tr>
       <w:tr>
         <w:tc>
           <w:tcPr>
-            <w:tcW w:type="dxa" w:w="2268"/>
+            <w:tcW w:type="dxa" w:w="2154"/>
           </w:tcPr>
           <w:p>
             <w:r/>
@@ -1327,7 +1634,7 @@
         </w:tc>
         <w:tc>
           <w:tcPr>
-            <w:tcW w:type="dxa" w:w="850"/>
+            <w:tcW w:type="dxa" w:w="794"/>
           </w:tcPr>
           <w:p>
             <w:r/>
@@ -1341,7 +1648,7 @@
         </w:tc>
         <w:tc>
           <w:tcPr>
-            <w:tcW w:type="dxa" w:w="6236"/>
+            <w:tcW w:type="dxa" w:w="5102"/>
           </w:tcPr>
           <w:p>
             <w:r/>
@@ -1355,7 +1662,7 @@
         </w:tc>
         <w:tc>
           <w:tcPr>
-            <w:tcW w:type="dxa" w:w="5102"/>
+            <w:tcW w:type="dxa" w:w="3969"/>
           </w:tcPr>
           <w:p>
             <w:r/>
@@ -1367,11 +1674,25 @@
             </w:r>
           </w:p>
         </w:tc>
+        <w:tc>
+          <w:tcPr>
+            <w:tcW w:type="dxa" w:w="1247"/>
+          </w:tcPr>
+          <w:p>
+            <w:r/>
+            <w:r>
+              <w:rPr>
+                <w:sz w:val="18"/>
+              </w:rPr>
+              <w:t>8–12</w:t>
+            </w:r>
+          </w:p>
+        </w:tc>
       </w:tr>
       <w:tr>
         <w:tc>
           <w:tcPr>
-            <w:tcW w:type="dxa" w:w="2268"/>
+            <w:tcW w:type="dxa" w:w="2154"/>
           </w:tcPr>
           <w:p>
             <w:r/>
@@ -1384,7 +1705,7 @@
         </w:tc>
         <w:tc>
           <w:tcPr>
-            <w:tcW w:type="dxa" w:w="850"/>
+            <w:tcW w:type="dxa" w:w="794"/>
           </w:tcPr>
           <w:p>
             <w:r/>
@@ -1398,7 +1719,7 @@
         </w:tc>
         <w:tc>
           <w:tcPr>
-            <w:tcW w:type="dxa" w:w="6236"/>
+            <w:tcW w:type="dxa" w:w="5102"/>
           </w:tcPr>
           <w:p>
             <w:r/>
@@ -1412,7 +1733,7 @@
         </w:tc>
         <w:tc>
           <w:tcPr>
-            <w:tcW w:type="dxa" w:w="5102"/>
+            <w:tcW w:type="dxa" w:w="3969"/>
           </w:tcPr>
           <w:p>
             <w:r/>
@@ -1424,11 +1745,25 @@
             </w:r>
           </w:p>
         </w:tc>
+        <w:tc>
+          <w:tcPr>
+            <w:tcW w:type="dxa" w:w="1247"/>
+          </w:tcPr>
+          <w:p>
+            <w:r/>
+            <w:r>
+              <w:rPr>
+                <w:sz w:val="18"/>
+              </w:rPr>
+              <w:t>8–12</w:t>
+            </w:r>
+          </w:p>
+        </w:tc>
       </w:tr>
       <w:tr>
         <w:tc>
           <w:tcPr>
-            <w:tcW w:type="dxa" w:w="2268"/>
+            <w:tcW w:type="dxa" w:w="2154"/>
           </w:tcPr>
           <w:p>
             <w:r/>
@@ -1442,7 +1777,7 @@
         </w:tc>
         <w:tc>
           <w:tcPr>
-            <w:tcW w:type="dxa" w:w="850"/>
+            <w:tcW w:type="dxa" w:w="794"/>
           </w:tcPr>
           <w:p>
             <w:r/>
@@ -1456,7 +1791,7 @@
         </w:tc>
         <w:tc>
           <w:tcPr>
-            <w:tcW w:type="dxa" w:w="6236"/>
+            <w:tcW w:type="dxa" w:w="5102"/>
           </w:tcPr>
           <w:p>
             <w:r/>
@@ -1470,7 +1805,7 @@
         </w:tc>
         <w:tc>
           <w:tcPr>
-            <w:tcW w:type="dxa" w:w="5102"/>
+            <w:tcW w:type="dxa" w:w="3969"/>
           </w:tcPr>
           <w:p>
             <w:r/>
@@ -1482,11 +1817,25 @@
             </w:r>
           </w:p>
         </w:tc>
+        <w:tc>
+          <w:tcPr>
+            <w:tcW w:type="dxa" w:w="1247"/>
+          </w:tcPr>
+          <w:p>
+            <w:r/>
+            <w:r>
+              <w:rPr>
+                <w:sz w:val="18"/>
+              </w:rPr>
+              <w:t>8–12</w:t>
+            </w:r>
+          </w:p>
+        </w:tc>
       </w:tr>
       <w:tr>
         <w:tc>
           <w:tcPr>
-            <w:tcW w:type="dxa" w:w="2268"/>
+            <w:tcW w:type="dxa" w:w="2154"/>
           </w:tcPr>
           <w:p>
             <w:r/>
@@ -1499,7 +1848,7 @@
         </w:tc>
         <w:tc>
           <w:tcPr>
-            <w:tcW w:type="dxa" w:w="850"/>
+            <w:tcW w:type="dxa" w:w="794"/>
           </w:tcPr>
           <w:p>
             <w:r/>
@@ -1513,7 +1862,7 @@
         </w:tc>
         <w:tc>
           <w:tcPr>
-            <w:tcW w:type="dxa" w:w="6236"/>
+            <w:tcW w:type="dxa" w:w="5102"/>
           </w:tcPr>
           <w:p>
             <w:r/>
@@ -1527,7 +1876,7 @@
         </w:tc>
         <w:tc>
           <w:tcPr>
-            <w:tcW w:type="dxa" w:w="5102"/>
+            <w:tcW w:type="dxa" w:w="3969"/>
           </w:tcPr>
           <w:p>
             <w:r/>
@@ -1539,11 +1888,25 @@
             </w:r>
           </w:p>
         </w:tc>
+        <w:tc>
+          <w:tcPr>
+            <w:tcW w:type="dxa" w:w="1247"/>
+          </w:tcPr>
+          <w:p>
+            <w:r/>
+            <w:r>
+              <w:rPr>
+                <w:sz w:val="18"/>
+              </w:rPr>
+              <w:t>8–12</w:t>
+            </w:r>
+          </w:p>
+        </w:tc>
       </w:tr>
       <w:tr>
         <w:tc>
           <w:tcPr>
-            <w:tcW w:type="dxa" w:w="2268"/>
+            <w:tcW w:type="dxa" w:w="2154"/>
           </w:tcPr>
           <w:p>
             <w:r/>
@@ -1557,7 +1920,7 @@
         </w:tc>
         <w:tc>
           <w:tcPr>
-            <w:tcW w:type="dxa" w:w="850"/>
+            <w:tcW w:type="dxa" w:w="794"/>
           </w:tcPr>
           <w:p>
             <w:r/>
@@ -1571,7 +1934,7 @@
         </w:tc>
         <w:tc>
           <w:tcPr>
-            <w:tcW w:type="dxa" w:w="6236"/>
+            <w:tcW w:type="dxa" w:w="5102"/>
           </w:tcPr>
           <w:p>
             <w:r/>
@@ -1585,7 +1948,7 @@
         </w:tc>
         <w:tc>
           <w:tcPr>
-            <w:tcW w:type="dxa" w:w="5102"/>
+            <w:tcW w:type="dxa" w:w="3969"/>
           </w:tcPr>
           <w:p>
             <w:r/>
@@ -1597,11 +1960,25 @@
             </w:r>
           </w:p>
         </w:tc>
+        <w:tc>
+          <w:tcPr>
+            <w:tcW w:type="dxa" w:w="1247"/>
+          </w:tcPr>
+          <w:p>
+            <w:r/>
+            <w:r>
+              <w:rPr>
+                <w:sz w:val="18"/>
+              </w:rPr>
+              <w:t>8–12</w:t>
+            </w:r>
+          </w:p>
+        </w:tc>
       </w:tr>
       <w:tr>
         <w:tc>
           <w:tcPr>
-            <w:tcW w:type="dxa" w:w="2268"/>
+            <w:tcW w:type="dxa" w:w="2154"/>
           </w:tcPr>
           <w:p>
             <w:r/>
@@ -1615,7 +1992,7 @@
         </w:tc>
         <w:tc>
           <w:tcPr>
-            <w:tcW w:type="dxa" w:w="850"/>
+            <w:tcW w:type="dxa" w:w="794"/>
           </w:tcPr>
           <w:p>
             <w:r/>
@@ -1629,7 +2006,7 @@
         </w:tc>
         <w:tc>
           <w:tcPr>
-            <w:tcW w:type="dxa" w:w="6236"/>
+            <w:tcW w:type="dxa" w:w="5102"/>
           </w:tcPr>
           <w:p>
             <w:r/>
@@ -1643,7 +2020,7 @@
         </w:tc>
         <w:tc>
           <w:tcPr>
-            <w:tcW w:type="dxa" w:w="5102"/>
+            <w:tcW w:type="dxa" w:w="3969"/>
           </w:tcPr>
           <w:p>
             <w:r/>
@@ -1655,11 +2032,25 @@
             </w:r>
           </w:p>
         </w:tc>
+        <w:tc>
+          <w:tcPr>
+            <w:tcW w:type="dxa" w:w="1247"/>
+          </w:tcPr>
+          <w:p>
+            <w:r/>
+            <w:r>
+              <w:rPr>
+                <w:sz w:val="18"/>
+              </w:rPr>
+              <w:t>8–12</w:t>
+            </w:r>
+          </w:p>
+        </w:tc>
       </w:tr>
       <w:tr>
         <w:tc>
           <w:tcPr>
-            <w:tcW w:type="dxa" w:w="2268"/>
+            <w:tcW w:type="dxa" w:w="2154"/>
           </w:tcPr>
           <w:p>
             <w:r/>
@@ -1672,7 +2063,7 @@
         </w:tc>
         <w:tc>
           <w:tcPr>
-            <w:tcW w:type="dxa" w:w="850"/>
+            <w:tcW w:type="dxa" w:w="794"/>
           </w:tcPr>
           <w:p>
             <w:r/>
@@ -1686,7 +2077,7 @@
         </w:tc>
         <w:tc>
           <w:tcPr>
-            <w:tcW w:type="dxa" w:w="6236"/>
+            <w:tcW w:type="dxa" w:w="5102"/>
           </w:tcPr>
           <w:p>
             <w:r/>
@@ -1700,7 +2091,7 @@
         </w:tc>
         <w:tc>
           <w:tcPr>
-            <w:tcW w:type="dxa" w:w="5102"/>
+            <w:tcW w:type="dxa" w:w="3969"/>
           </w:tcPr>
           <w:p>
             <w:r/>
@@ -1712,11 +2103,25 @@
             </w:r>
           </w:p>
         </w:tc>
+        <w:tc>
+          <w:tcPr>
+            <w:tcW w:type="dxa" w:w="1247"/>
+          </w:tcPr>
+          <w:p>
+            <w:r/>
+            <w:r>
+              <w:rPr>
+                <w:sz w:val="18"/>
+              </w:rPr>
+              <w:t>8–12</w:t>
+            </w:r>
+          </w:p>
+        </w:tc>
       </w:tr>
       <w:tr>
         <w:tc>
           <w:tcPr>
-            <w:tcW w:type="dxa" w:w="2268"/>
+            <w:tcW w:type="dxa" w:w="2154"/>
           </w:tcPr>
           <w:p>
             <w:r/>
@@ -1729,7 +2134,7 @@
         </w:tc>
         <w:tc>
           <w:tcPr>
-            <w:tcW w:type="dxa" w:w="850"/>
+            <w:tcW w:type="dxa" w:w="794"/>
           </w:tcPr>
           <w:p>
             <w:r/>
@@ -1743,7 +2148,7 @@
         </w:tc>
         <w:tc>
           <w:tcPr>
-            <w:tcW w:type="dxa" w:w="6236"/>
+            <w:tcW w:type="dxa" w:w="5102"/>
           </w:tcPr>
           <w:p>
             <w:r/>
@@ -1757,7 +2162,7 @@
         </w:tc>
         <w:tc>
           <w:tcPr>
-            <w:tcW w:type="dxa" w:w="5102"/>
+            <w:tcW w:type="dxa" w:w="3969"/>
           </w:tcPr>
           <w:p>
             <w:r/>
@@ -1769,11 +2174,25 @@
             </w:r>
           </w:p>
         </w:tc>
+        <w:tc>
+          <w:tcPr>
+            <w:tcW w:type="dxa" w:w="1247"/>
+          </w:tcPr>
+          <w:p>
+            <w:r/>
+            <w:r>
+              <w:rPr>
+                <w:sz w:val="18"/>
+              </w:rPr>
+              <w:t>8–12</w:t>
+            </w:r>
+          </w:p>
+        </w:tc>
       </w:tr>
       <w:tr>
         <w:tc>
           <w:tcPr>
-            <w:tcW w:type="dxa" w:w="2268"/>
+            <w:tcW w:type="dxa" w:w="2154"/>
           </w:tcPr>
           <w:p>
             <w:r/>
@@ -1787,7 +2206,7 @@
         </w:tc>
         <w:tc>
           <w:tcPr>
-            <w:tcW w:type="dxa" w:w="850"/>
+            <w:tcW w:type="dxa" w:w="794"/>
           </w:tcPr>
           <w:p>
             <w:r/>
@@ -1801,7 +2220,7 @@
         </w:tc>
         <w:tc>
           <w:tcPr>
-            <w:tcW w:type="dxa" w:w="6236"/>
+            <w:tcW w:type="dxa" w:w="5102"/>
           </w:tcPr>
           <w:p>
             <w:r/>
@@ -1815,7 +2234,7 @@
         </w:tc>
         <w:tc>
           <w:tcPr>
-            <w:tcW w:type="dxa" w:w="5102"/>
+            <w:tcW w:type="dxa" w:w="3969"/>
           </w:tcPr>
           <w:p>
             <w:r/>
@@ -1827,11 +2246,25 @@
             </w:r>
           </w:p>
         </w:tc>
+        <w:tc>
+          <w:tcPr>
+            <w:tcW w:type="dxa" w:w="1247"/>
+          </w:tcPr>
+          <w:p>
+            <w:r/>
+            <w:r>
+              <w:rPr>
+                <w:sz w:val="18"/>
+              </w:rPr>
+              <w:t>8–12</w:t>
+            </w:r>
+          </w:p>
+        </w:tc>
       </w:tr>
       <w:tr>
         <w:tc>
           <w:tcPr>
-            <w:tcW w:type="dxa" w:w="2268"/>
+            <w:tcW w:type="dxa" w:w="2154"/>
           </w:tcPr>
           <w:p>
             <w:r/>
@@ -1847,20 +2280,7 @@
         </w:tc>
         <w:tc>
           <w:tcPr>
-            <w:tcW w:type="dxa" w:w="850"/>
-          </w:tcPr>
-          <w:p>
-            <w:r/>
-            <w:r>
-              <w:rPr>
-                <w:sz w:val="18"/>
-              </w:rPr>
-            </w:r>
-          </w:p>
-        </w:tc>
-        <w:tc>
-          <w:tcPr>
-            <w:tcW w:type="dxa" w:w="6236"/>
+            <w:tcW w:type="dxa" w:w="794"/>
           </w:tcPr>
           <w:p>
             <w:r/>
@@ -1884,11 +2304,37 @@
             </w:r>
           </w:p>
         </w:tc>
+        <w:tc>
+          <w:tcPr>
+            <w:tcW w:type="dxa" w:w="3969"/>
+          </w:tcPr>
+          <w:p>
+            <w:r/>
+            <w:r>
+              <w:rPr>
+                <w:sz w:val="18"/>
+              </w:rPr>
+            </w:r>
+          </w:p>
+        </w:tc>
+        <w:tc>
+          <w:tcPr>
+            <w:tcW w:type="dxa" w:w="1247"/>
+          </w:tcPr>
+          <w:p>
+            <w:r/>
+            <w:r>
+              <w:rPr>
+                <w:sz w:val="18"/>
+              </w:rPr>
+            </w:r>
+          </w:p>
+        </w:tc>
       </w:tr>
       <w:tr>
         <w:tc>
           <w:tcPr>
-            <w:tcW w:type="dxa" w:w="2268"/>
+            <w:tcW w:type="dxa" w:w="2154"/>
           </w:tcPr>
           <w:p>
             <w:r/>
@@ -1902,7 +2348,7 @@
         </w:tc>
         <w:tc>
           <w:tcPr>
-            <w:tcW w:type="dxa" w:w="850"/>
+            <w:tcW w:type="dxa" w:w="794"/>
           </w:tcPr>
           <w:p>
             <w:r/>
@@ -1916,7 +2362,7 @@
         </w:tc>
         <w:tc>
           <w:tcPr>
-            <w:tcW w:type="dxa" w:w="6236"/>
+            <w:tcW w:type="dxa" w:w="5102"/>
           </w:tcPr>
           <w:p>
             <w:r/>
@@ -1930,7 +2376,7 @@
         </w:tc>
         <w:tc>
           <w:tcPr>
-            <w:tcW w:type="dxa" w:w="5102"/>
+            <w:tcW w:type="dxa" w:w="3969"/>
           </w:tcPr>
           <w:p>
             <w:r/>
@@ -1942,11 +2388,25 @@
             </w:r>
           </w:p>
         </w:tc>
+        <w:tc>
+          <w:tcPr>
+            <w:tcW w:type="dxa" w:w="1247"/>
+          </w:tcPr>
+          <w:p>
+            <w:r/>
+            <w:r>
+              <w:rPr>
+                <w:sz w:val="18"/>
+              </w:rPr>
+              <w:t>13–15</w:t>
+            </w:r>
+          </w:p>
+        </w:tc>
       </w:tr>
       <w:tr>
         <w:tc>
           <w:tcPr>
-            <w:tcW w:type="dxa" w:w="2268"/>
+            <w:tcW w:type="dxa" w:w="2154"/>
           </w:tcPr>
           <w:p>
             <w:r/>
@@ -1960,7 +2420,7 @@
         </w:tc>
         <w:tc>
           <w:tcPr>
-            <w:tcW w:type="dxa" w:w="850"/>
+            <w:tcW w:type="dxa" w:w="794"/>
           </w:tcPr>
           <w:p>
             <w:r/>
@@ -1974,7 +2434,7 @@
         </w:tc>
         <w:tc>
           <w:tcPr>
-            <w:tcW w:type="dxa" w:w="6236"/>
+            <w:tcW w:type="dxa" w:w="5102"/>
           </w:tcPr>
           <w:p>
             <w:r/>
@@ -1988,7 +2448,7 @@
         </w:tc>
         <w:tc>
           <w:tcPr>
-            <w:tcW w:type="dxa" w:w="5102"/>
+            <w:tcW w:type="dxa" w:w="3969"/>
           </w:tcPr>
           <w:p>
             <w:r/>
@@ -2000,11 +2460,25 @@
             </w:r>
           </w:p>
         </w:tc>
+        <w:tc>
+          <w:tcPr>
+            <w:tcW w:type="dxa" w:w="1247"/>
+          </w:tcPr>
+          <w:p>
+            <w:r/>
+            <w:r>
+              <w:rPr>
+                <w:sz w:val="18"/>
+              </w:rPr>
+              <w:t>13–15</w:t>
+            </w:r>
+          </w:p>
+        </w:tc>
       </w:tr>
       <w:tr>
         <w:tc>
           <w:tcPr>
-            <w:tcW w:type="dxa" w:w="2268"/>
+            <w:tcW w:type="dxa" w:w="2154"/>
           </w:tcPr>
           <w:p>
             <w:r/>
@@ -2018,7 +2492,7 @@
         </w:tc>
         <w:tc>
           <w:tcPr>
-            <w:tcW w:type="dxa" w:w="850"/>
+            <w:tcW w:type="dxa" w:w="794"/>
           </w:tcPr>
           <w:p>
             <w:r/>
@@ -2032,7 +2506,7 @@
         </w:tc>
         <w:tc>
           <w:tcPr>
-            <w:tcW w:type="dxa" w:w="6236"/>
+            <w:tcW w:type="dxa" w:w="5102"/>
           </w:tcPr>
           <w:p>
             <w:r/>
@@ -2046,7 +2520,7 @@
         </w:tc>
         <w:tc>
           <w:tcPr>
-            <w:tcW w:type="dxa" w:w="5102"/>
+            <w:tcW w:type="dxa" w:w="3969"/>
           </w:tcPr>
           <w:p>
             <w:r/>
@@ -2058,11 +2532,25 @@
             </w:r>
           </w:p>
         </w:tc>
+        <w:tc>
+          <w:tcPr>
+            <w:tcW w:type="dxa" w:w="1247"/>
+          </w:tcPr>
+          <w:p>
+            <w:r/>
+            <w:r>
+              <w:rPr>
+                <w:sz w:val="18"/>
+              </w:rPr>
+              <w:t>13–15</w:t>
+            </w:r>
+          </w:p>
+        </w:tc>
       </w:tr>
       <w:tr>
         <w:tc>
           <w:tcPr>
-            <w:tcW w:type="dxa" w:w="2268"/>
+            <w:tcW w:type="dxa" w:w="2154"/>
           </w:tcPr>
           <w:p>
             <w:r/>
@@ -2076,7 +2564,7 @@
         </w:tc>
         <w:tc>
           <w:tcPr>
-            <w:tcW w:type="dxa" w:w="850"/>
+            <w:tcW w:type="dxa" w:w="794"/>
           </w:tcPr>
           <w:p>
             <w:r/>
@@ -2090,7 +2578,7 @@
         </w:tc>
         <w:tc>
           <w:tcPr>
-            <w:tcW w:type="dxa" w:w="6236"/>
+            <w:tcW w:type="dxa" w:w="5102"/>
           </w:tcPr>
           <w:p>
             <w:r/>
@@ -2104,7 +2592,7 @@
         </w:tc>
         <w:tc>
           <w:tcPr>
-            <w:tcW w:type="dxa" w:w="5102"/>
+            <w:tcW w:type="dxa" w:w="3969"/>
           </w:tcPr>
           <w:p>
             <w:r/>
@@ -2116,11 +2604,25 @@
             </w:r>
           </w:p>
         </w:tc>
+        <w:tc>
+          <w:tcPr>
+            <w:tcW w:type="dxa" w:w="1247"/>
+          </w:tcPr>
+          <w:p>
+            <w:r/>
+            <w:r>
+              <w:rPr>
+                <w:sz w:val="18"/>
+              </w:rPr>
+              <w:t>13–15</w:t>
+            </w:r>
+          </w:p>
+        </w:tc>
       </w:tr>
       <w:tr>
         <w:tc>
           <w:tcPr>
-            <w:tcW w:type="dxa" w:w="2268"/>
+            <w:tcW w:type="dxa" w:w="2154"/>
           </w:tcPr>
           <w:p>
             <w:r/>
@@ -2136,20 +2638,7 @@
         </w:tc>
         <w:tc>
           <w:tcPr>
-            <w:tcW w:type="dxa" w:w="850"/>
-          </w:tcPr>
-          <w:p>
-            <w:r/>
-            <w:r>
-              <w:rPr>
-                <w:sz w:val="18"/>
-              </w:rPr>
-            </w:r>
-          </w:p>
-        </w:tc>
-        <w:tc>
-          <w:tcPr>
-            <w:tcW w:type="dxa" w:w="6236"/>
+            <w:tcW w:type="dxa" w:w="794"/>
           </w:tcPr>
           <w:p>
             <w:r/>
@@ -2173,11 +2662,37 @@
             </w:r>
           </w:p>
         </w:tc>
+        <w:tc>
+          <w:tcPr>
+            <w:tcW w:type="dxa" w:w="3969"/>
+          </w:tcPr>
+          <w:p>
+            <w:r/>
+            <w:r>
+              <w:rPr>
+                <w:sz w:val="18"/>
+              </w:rPr>
+            </w:r>
+          </w:p>
+        </w:tc>
+        <w:tc>
+          <w:tcPr>
+            <w:tcW w:type="dxa" w:w="1247"/>
+          </w:tcPr>
+          <w:p>
+            <w:r/>
+            <w:r>
+              <w:rPr>
+                <w:sz w:val="18"/>
+              </w:rPr>
+            </w:r>
+          </w:p>
+        </w:tc>
       </w:tr>
       <w:tr>
         <w:tc>
           <w:tcPr>
-            <w:tcW w:type="dxa" w:w="2268"/>
+            <w:tcW w:type="dxa" w:w="2154"/>
           </w:tcPr>
           <w:p>
             <w:r/>
@@ -2191,7 +2706,7 @@
         </w:tc>
         <w:tc>
           <w:tcPr>
-            <w:tcW w:type="dxa" w:w="850"/>
+            <w:tcW w:type="dxa" w:w="794"/>
           </w:tcPr>
           <w:p>
             <w:r/>
@@ -2205,7 +2720,7 @@
         </w:tc>
         <w:tc>
           <w:tcPr>
-            <w:tcW w:type="dxa" w:w="6236"/>
+            <w:tcW w:type="dxa" w:w="5102"/>
           </w:tcPr>
           <w:p>
             <w:r/>
@@ -2219,7 +2734,7 @@
         </w:tc>
         <w:tc>
           <w:tcPr>
-            <w:tcW w:type="dxa" w:w="5102"/>
+            <w:tcW w:type="dxa" w:w="3969"/>
           </w:tcPr>
           <w:p>
             <w:r/>
@@ -2228,6 +2743,20 @@
                 <w:sz w:val="18"/>
               </w:rPr>
               <w:t>End Matter, 'Funding'</w:t>
+            </w:r>
+          </w:p>
+        </w:tc>
+        <w:tc>
+          <w:tcPr>
+            <w:tcW w:type="dxa" w:w="1247"/>
+          </w:tcPr>
+          <w:p>
+            <w:r/>
+            <w:r>
+              <w:rPr>
+                <w:sz w:val="18"/>
+              </w:rPr>
+              <w:t>Title page</w:t>
             </w:r>
           </w:p>
         </w:tc>

</xml_diff>

<commit_message>
STROBE: item-specific page numbers, N/A for non-applicable, fail on missing PDF tools
Co-Authored-By: Tatsuki Onishi <bougtoir@gmail.com>
</commit_message>
<xml_diff>
--- a/documents/JECH/STROBE_checklist_JECH_EN.docx
+++ b/documents/JECH/STROBE_checklist_JECH_EN.docx
@@ -1400,7 +1400,7 @@
               <w:rPr>
                 <w:sz w:val="18"/>
               </w:rPr>
-              <w:t>6–7</w:t>
+              <w:t>N/A</w:t>
             </w:r>
           </w:p>
         </w:tc>
@@ -1755,7 +1755,7 @@
               <w:rPr>
                 <w:sz w:val="18"/>
               </w:rPr>
-              <w:t>8–12</w:t>
+              <w:t>N/A</w:t>
             </w:r>
           </w:p>
         </w:tc>
@@ -1827,7 +1827,7 @@
               <w:rPr>
                 <w:sz w:val="18"/>
               </w:rPr>
-              <w:t>8–12</w:t>
+              <w:t>7, 9</w:t>
             </w:r>
           </w:p>
         </w:tc>
@@ -1898,7 +1898,7 @@
               <w:rPr>
                 <w:sz w:val="18"/>
               </w:rPr>
-              <w:t>8–12</w:t>
+              <w:t>9</w:t>
             </w:r>
           </w:p>
         </w:tc>
@@ -1970,7 +1970,7 @@
               <w:rPr>
                 <w:sz w:val="18"/>
               </w:rPr>
-              <w:t>8–12</w:t>
+              <w:t>7–9</w:t>
             </w:r>
           </w:p>
         </w:tc>
@@ -2042,7 +2042,7 @@
               <w:rPr>
                 <w:sz w:val="18"/>
               </w:rPr>
-              <w:t>8–12</w:t>
+              <w:t>10</w:t>
             </w:r>
           </w:p>
         </w:tc>
@@ -2113,7 +2113,7 @@
               <w:rPr>
                 <w:sz w:val="18"/>
               </w:rPr>
-              <w:t>8–12</w:t>
+              <w:t>18–20</w:t>
             </w:r>
           </w:p>
         </w:tc>
@@ -2184,7 +2184,7 @@
               <w:rPr>
                 <w:sz w:val="18"/>
               </w:rPr>
-              <w:t>8–12</w:t>
+              <w:t>N/A</w:t>
             </w:r>
           </w:p>
         </w:tc>
@@ -2742,7 +2742,7 @@
               <w:rPr>
                 <w:sz w:val="18"/>
               </w:rPr>
-              <w:t>End Matter, 'Funding'</w:t>
+              <w:t>Title page, 'Funding'</w:t>
             </w:r>
           </w:p>
         </w:tc>

</xml_diff>